<commit_message>
(no svn log message)
svn-revision: 632
</commit_message>
<xml_diff>
--- a/files/Theodore von K.docx
+++ b/files/Theodore von K.docx
@@ -72,7 +72,7 @@
                     <pic:cNvPicPr/>
                   </pic:nvPicPr>
                   <pic:blipFill>
-                    <a:blip r:embed="rId4">
+                    <a:blip r:embed="rId5">
                       <a:extLst>
                         <a:ext uri="{28A0092B-C50C-407E-A947-70E740481C1C}">
                           <a14:useLocalDpi xmlns:a14="http://schemas.microsoft.com/office/drawing/2010/main" val="0"/>
@@ -126,8 +126,6 @@
       <w:r>
         <w:t xml:space="preserve"> of the twentieth century. </w:t>
       </w:r>
-      <w:bookmarkStart w:id="1" w:name="_GoBack"/>
-      <w:bookmarkEnd w:id="1"/>
     </w:p>
     <w:p>
       <w:pPr>
@@ -252,6 +250,9 @@
     <w:p>
       <w:pPr>
         <w:pStyle w:val="NormalWeb"/>
+        <w:rPr>
+          <w:ins w:id="1" w:author="Josef M Sabuda" w:date="2016-02-14T20:14:00Z"/>
+        </w:rPr>
       </w:pPr>
       <w:r>
         <w:t xml:space="preserve">After </w:t>
@@ -309,6 +310,85 @@
     <w:p>
       <w:pPr>
         <w:pStyle w:val="NormalWeb"/>
+        <w:ind w:left="1440"/>
+      </w:pPr>
+      <w:r>
+        <w:drawing>
+          <wp:inline distT="0" distB="0" distL="0" distR="0">
+            <wp:extent cx="3924300" cy="3057138"/>
+            <wp:effectExtent l="0" t="0" r="0" b="0"/>
+            <wp:docPr id="3" name="Picture 3" descr="https://upload.wikimedia.org/wikipedia/commons/f/fd/First_JATO_assisted_Flight_-_GPN-2000-001538.jpg"/>
+            <wp:cNvGraphicFramePr>
+              <a:graphicFrameLocks xmlns:a="http://schemas.openxmlformats.org/drawingml/2006/main" noChangeAspect="1"/>
+            </wp:cNvGraphicFramePr>
+            <a:graphic xmlns:a="http://schemas.openxmlformats.org/drawingml/2006/main">
+              <a:graphicData uri="http://schemas.openxmlformats.org/drawingml/2006/picture">
+                <pic:pic xmlns:pic="http://schemas.openxmlformats.org/drawingml/2006/picture">
+                  <pic:nvPicPr>
+                    <pic:cNvPr id="0" name="Picture 1" descr="https://upload.wikimedia.org/wikipedia/commons/f/fd/First_JATO_assisted_Flight_-_GPN-2000-001538.jpg"/>
+                    <pic:cNvPicPr>
+                      <a:picLocks noChangeAspect="1" noChangeArrowheads="1"/>
+                    </pic:cNvPicPr>
+                  </pic:nvPicPr>
+                  <pic:blipFill>
+                    <a:blip r:embed="rId6" cstate="print">
+                      <a:extLst>
+                        <a:ext uri="{28A0092B-C50C-407E-A947-70E740481C1C}">
+                          <a14:useLocalDpi xmlns:a14="http://schemas.microsoft.com/office/drawing/2010/main" val="0"/>
+                        </a:ext>
+                      </a:extLst>
+                    </a:blip>
+                    <a:srcRect/>
+                    <a:stretch>
+                      <a:fillRect/>
+                    </a:stretch>
+                  </pic:blipFill>
+                  <pic:spPr bwMode="auto">
+                    <a:xfrm>
+                      <a:off x="0" y="0"/>
+                      <a:ext cx="3938433" cy="3068148"/>
+                    </a:xfrm>
+                    <a:prstGeom prst="rect">
+                      <a:avLst/>
+                    </a:prstGeom>
+                    <a:noFill/>
+                    <a:ln>
+                      <a:noFill/>
+                    </a:ln>
+                  </pic:spPr>
+                </pic:pic>
+              </a:graphicData>
+            </a:graphic>
+          </wp:inline>
+        </w:drawing>
+      </w:r>
+    </w:p>
+    <w:p>
+      <w:pPr>
+        <w:pStyle w:val="NormalWeb"/>
+        <w:ind w:left="1440"/>
+      </w:pPr>
+      <w:r>
+        <w:tab/>
+      </w:r>
+      <w:r>
+        <w:tab/>
+      </w:r>
+      <w:r>
+        <w:tab/>
+      </w:r>
+      <w:bookmarkStart w:id="2" w:name="_GoBack"/>
+      <w:bookmarkEnd w:id="2"/>
+      <w:r>
+        <w:t>Jet Assisted Take Off</w:t>
+      </w:r>
+    </w:p>
+    <w:p>
+      <w:pPr>
+        <w:pStyle w:val="NormalWeb"/>
+        <w:rPr>
+          <w:ins w:id="3" w:author="Josef M Sabuda" w:date="2016-02-14T20:17:00Z"/>
+        </w:rPr>
       </w:pPr>
       <w:r>
         <w:t xml:space="preserve">He and a former graduate student (Frank </w:t>
@@ -428,6 +508,83 @@
     <w:p>
       <w:pPr>
         <w:pStyle w:val="NormalWeb"/>
+        <w:rPr>
+          <w:ins w:id="4" w:author="Josef M Sabuda" w:date="2016-02-14T20:13:00Z"/>
+        </w:rPr>
+      </w:pPr>
+    </w:p>
+    <w:p>
+      <w:pPr>
+        <w:pStyle w:val="NormalWeb"/>
+      </w:pPr>
+      <w:r>
+        <w:rPr>
+          <w:noProof/>
+        </w:rPr>
+        <w:drawing>
+          <wp:inline distT="0" distB="0" distL="0" distR="0" wp14:anchorId="3E498DD7" wp14:editId="20B2B325">
+            <wp:extent cx="5638577" cy="1059180"/>
+            <wp:effectExtent l="0" t="0" r="635" b="7620"/>
+            <wp:docPr id="1" name="Picture 1" descr="http://www.jpl.nasa.gov/assets/images/logo_nasa_trio_black@2x.png"/>
+            <wp:cNvGraphicFramePr>
+              <a:graphicFrameLocks xmlns:a="http://schemas.openxmlformats.org/drawingml/2006/main" noChangeAspect="1"/>
+            </wp:cNvGraphicFramePr>
+            <a:graphic xmlns:a="http://schemas.openxmlformats.org/drawingml/2006/main">
+              <a:graphicData uri="http://schemas.openxmlformats.org/drawingml/2006/picture">
+                <pic:pic xmlns:pic="http://schemas.openxmlformats.org/drawingml/2006/picture">
+                  <pic:nvPicPr>
+                    <pic:cNvPr id="0" name="Picture 3" descr="http://www.jpl.nasa.gov/assets/images/logo_nasa_trio_black@2x.png"/>
+                    <pic:cNvPicPr>
+                      <a:picLocks noChangeAspect="1" noChangeArrowheads="1"/>
+                    </pic:cNvPicPr>
+                  </pic:nvPicPr>
+                  <pic:blipFill>
+                    <a:blip r:embed="rId7">
+                      <a:extLst>
+                        <a:ext uri="{28A0092B-C50C-407E-A947-70E740481C1C}">
+                          <a14:useLocalDpi xmlns:a14="http://schemas.microsoft.com/office/drawing/2010/main" val="0"/>
+                        </a:ext>
+                      </a:extLst>
+                    </a:blip>
+                    <a:srcRect/>
+                    <a:stretch>
+                      <a:fillRect/>
+                    </a:stretch>
+                  </pic:blipFill>
+                  <pic:spPr bwMode="auto">
+                    <a:xfrm>
+                      <a:off x="0" y="0"/>
+                      <a:ext cx="5648375" cy="1061020"/>
+                    </a:xfrm>
+                    <a:prstGeom prst="rect">
+                      <a:avLst/>
+                    </a:prstGeom>
+                    <a:noFill/>
+                    <a:ln>
+                      <a:noFill/>
+                    </a:ln>
+                  </pic:spPr>
+                </pic:pic>
+              </a:graphicData>
+            </a:graphic>
+          </wp:inline>
+        </w:drawing>
+      </w:r>
+    </w:p>
+    <w:p>
+      <w:pPr>
+        <w:pStyle w:val="NormalWeb"/>
+        <w:rPr>
+          <w:ins w:id="5" w:author="Josef M Sabuda" w:date="2016-02-14T20:17:00Z"/>
+        </w:rPr>
+      </w:pPr>
+    </w:p>
+    <w:p>
+      <w:pPr>
+        <w:pStyle w:val="NormalWeb"/>
+        <w:rPr>
+          <w:ins w:id="6" w:author="Josef M Sabuda" w:date="2016-02-14T20:16:00Z"/>
+        </w:rPr>
       </w:pPr>
       <w:r>
         <w:t xml:space="preserve">After </w:t>
@@ -472,7 +629,11 @@
         <w:t>á</w:t>
       </w:r>
       <w:r>
-        <w:t xml:space="preserve">n was instrumental in recognizing its importance for both faster and more efficient flight. </w:t>
+        <w:t xml:space="preserve">n was </w:t>
+      </w:r>
+      <w:r>
+        <w:lastRenderedPageBreak/>
+        <w:t xml:space="preserve">instrumental in recognizing its importance for both faster and more efficient flight. </w:t>
       </w:r>
       <w:r>
         <w:t>T</w:t>
@@ -496,6 +657,68 @@
     <w:p>
       <w:pPr>
         <w:pStyle w:val="NormalWeb"/>
+        <w:ind w:left="720" w:firstLine="720"/>
+      </w:pPr>
+      <w:r>
+        <w:t xml:space="preserve">     </w:t>
+      </w:r>
+      <w:r>
+        <w:t xml:space="preserve"> </w:t>
+      </w:r>
+      <w:r>
+        <w:drawing>
+          <wp:inline distT="0" distB="0" distL="0" distR="0" wp14:anchorId="0C671162" wp14:editId="69129BFD">
+            <wp:extent cx="3786286" cy="2425432"/>
+            <wp:effectExtent l="0" t="0" r="5080" b="0"/>
+            <wp:docPr id="4" name="Picture 4" descr="https://upload.wikimedia.org/wikipedia/commons/3/35/Aspect.ratio.b52.arp.jpg"/>
+            <wp:cNvGraphicFramePr>
+              <a:graphicFrameLocks xmlns:a="http://schemas.openxmlformats.org/drawingml/2006/main" noChangeAspect="1"/>
+            </wp:cNvGraphicFramePr>
+            <a:graphic xmlns:a="http://schemas.openxmlformats.org/drawingml/2006/main">
+              <a:graphicData uri="http://schemas.openxmlformats.org/drawingml/2006/picture">
+                <pic:pic xmlns:pic="http://schemas.openxmlformats.org/drawingml/2006/picture">
+                  <pic:nvPicPr>
+                    <pic:cNvPr id="0" name="Picture 3" descr="https://upload.wikimedia.org/wikipedia/commons/3/35/Aspect.ratio.b52.arp.jpg"/>
+                    <pic:cNvPicPr>
+                      <a:picLocks noChangeAspect="1" noChangeArrowheads="1"/>
+                    </pic:cNvPicPr>
+                  </pic:nvPicPr>
+                  <pic:blipFill>
+                    <a:blip r:embed="rId8" cstate="print">
+                      <a:extLst>
+                        <a:ext uri="{28A0092B-C50C-407E-A947-70E740481C1C}">
+                          <a14:useLocalDpi xmlns:a14="http://schemas.microsoft.com/office/drawing/2010/main" val="0"/>
+                        </a:ext>
+                      </a:extLst>
+                    </a:blip>
+                    <a:srcRect/>
+                    <a:stretch>
+                      <a:fillRect/>
+                    </a:stretch>
+                  </pic:blipFill>
+                  <pic:spPr bwMode="auto">
+                    <a:xfrm>
+                      <a:off x="0" y="0"/>
+                      <a:ext cx="3808958" cy="2439955"/>
+                    </a:xfrm>
+                    <a:prstGeom prst="rect">
+                      <a:avLst/>
+                    </a:prstGeom>
+                    <a:noFill/>
+                    <a:ln>
+                      <a:noFill/>
+                    </a:ln>
+                  </pic:spPr>
+                </pic:pic>
+              </a:graphicData>
+            </a:graphic>
+          </wp:inline>
+        </w:drawing>
+      </w:r>
+    </w:p>
+    <w:p>
+      <w:pPr>
+        <w:pStyle w:val="NormalWeb"/>
       </w:pPr>
       <w:r>
         <w:t>After officially retiring from his Caltech positions in 1949, von Kármán</w:t>
@@ -525,6 +748,66 @@
     <w:p>
       <w:pPr>
         <w:pStyle w:val="NormalWeb"/>
+        <w:ind w:left="540" w:right="540"/>
+        <w:jc w:val="center"/>
+      </w:pPr>
+      <w:r>
+        <w:drawing>
+          <wp:inline distT="0" distB="0" distL="0" distR="0">
+            <wp:extent cx="3329940" cy="2095500"/>
+            <wp:effectExtent l="0" t="0" r="3810" b="0"/>
+            <wp:docPr id="5" name="Picture 5" descr="https://www.nsf.gov/news/mmg/media/images/medal_of_science_f_f6d6ba16-2fe6-429e-8ef9-06f61378a3c1.jpg"/>
+            <wp:cNvGraphicFramePr>
+              <a:graphicFrameLocks xmlns:a="http://schemas.openxmlformats.org/drawingml/2006/main" noChangeAspect="1"/>
+            </wp:cNvGraphicFramePr>
+            <a:graphic xmlns:a="http://schemas.openxmlformats.org/drawingml/2006/main">
+              <a:graphicData uri="http://schemas.openxmlformats.org/drawingml/2006/picture">
+                <pic:pic xmlns:pic="http://schemas.openxmlformats.org/drawingml/2006/picture">
+                  <pic:nvPicPr>
+                    <pic:cNvPr id="0" name="Picture 5" descr="https://www.nsf.gov/news/mmg/media/images/medal_of_science_f_f6d6ba16-2fe6-429e-8ef9-06f61378a3c1.jpg"/>
+                    <pic:cNvPicPr>
+                      <a:picLocks noChangeAspect="1" noChangeArrowheads="1"/>
+                    </pic:cNvPicPr>
+                  </pic:nvPicPr>
+                  <pic:blipFill>
+                    <a:blip r:embed="rId9">
+                      <a:extLst>
+                        <a:ext uri="{28A0092B-C50C-407E-A947-70E740481C1C}">
+                          <a14:useLocalDpi xmlns:a14="http://schemas.microsoft.com/office/drawing/2010/main" val="0"/>
+                        </a:ext>
+                      </a:extLst>
+                    </a:blip>
+                    <a:srcRect/>
+                    <a:stretch>
+                      <a:fillRect/>
+                    </a:stretch>
+                  </pic:blipFill>
+                  <pic:spPr bwMode="auto">
+                    <a:xfrm>
+                      <a:off x="0" y="0"/>
+                      <a:ext cx="3329940" cy="2095500"/>
+                    </a:xfrm>
+                    <a:prstGeom prst="rect">
+                      <a:avLst/>
+                    </a:prstGeom>
+                    <a:noFill/>
+                    <a:ln>
+                      <a:noFill/>
+                    </a:ln>
+                  </pic:spPr>
+                </pic:pic>
+              </a:graphicData>
+            </a:graphic>
+          </wp:inline>
+        </w:drawing>
+      </w:r>
+    </w:p>
+    <w:p>
+      <w:pPr>
+        <w:pStyle w:val="NormalWeb"/>
+        <w:rPr>
+          <w:ins w:id="7" w:author="Josef M Sabuda" w:date="2016-02-14T20:19:00Z"/>
+        </w:rPr>
       </w:pPr>
       <w:r>
         <w:t>Von K</w:t>
@@ -653,13 +936,70 @@
     <w:p>
       <w:pPr>
         <w:pStyle w:val="NormalWeb"/>
+        <w:jc w:val="center"/>
+      </w:pPr>
+      <w:r>
+        <w:lastRenderedPageBreak/>
+        <w:drawing>
+          <wp:inline distT="0" distB="0" distL="0" distR="0">
+            <wp:extent cx="2377440" cy="708660"/>
+            <wp:effectExtent l="0" t="0" r="3810" b="0"/>
+            <wp:docPr id="6" name="Picture 6" descr="http://image2.findagrave.com/photos250/photos/2004/231/7936_109293156405.jpg"/>
+            <wp:cNvGraphicFramePr>
+              <a:graphicFrameLocks xmlns:a="http://schemas.openxmlformats.org/drawingml/2006/main" noChangeAspect="1"/>
+            </wp:cNvGraphicFramePr>
+            <a:graphic xmlns:a="http://schemas.openxmlformats.org/drawingml/2006/main">
+              <a:graphicData uri="http://schemas.openxmlformats.org/drawingml/2006/picture">
+                <pic:pic xmlns:pic="http://schemas.openxmlformats.org/drawingml/2006/picture">
+                  <pic:nvPicPr>
+                    <pic:cNvPr id="0" name="Picture 7" descr="http://image2.findagrave.com/photos250/photos/2004/231/7936_109293156405.jpg"/>
+                    <pic:cNvPicPr>
+                      <a:picLocks noChangeAspect="1" noChangeArrowheads="1"/>
+                    </pic:cNvPicPr>
+                  </pic:nvPicPr>
+                  <pic:blipFill>
+                    <a:blip r:embed="rId10">
+                      <a:extLst>
+                        <a:ext uri="{28A0092B-C50C-407E-A947-70E740481C1C}">
+                          <a14:useLocalDpi xmlns:a14="http://schemas.microsoft.com/office/drawing/2010/main" val="0"/>
+                        </a:ext>
+                      </a:extLst>
+                    </a:blip>
+                    <a:srcRect/>
+                    <a:stretch>
+                      <a:fillRect/>
+                    </a:stretch>
+                  </pic:blipFill>
+                  <pic:spPr bwMode="auto">
+                    <a:xfrm>
+                      <a:off x="0" y="0"/>
+                      <a:ext cx="2377440" cy="708660"/>
+                    </a:xfrm>
+                    <a:prstGeom prst="rect">
+                      <a:avLst/>
+                    </a:prstGeom>
+                    <a:noFill/>
+                    <a:ln>
+                      <a:noFill/>
+                    </a:ln>
+                  </pic:spPr>
+                </pic:pic>
+              </a:graphicData>
+            </a:graphic>
+          </wp:inline>
+        </w:drawing>
+      </w:r>
+    </w:p>
+    <w:p>
+      <w:pPr>
+        <w:pStyle w:val="NormalWeb"/>
       </w:pPr>
       <w:r>
         <w:t xml:space="preserve">For more on Theodore von Karman: </w:t>
       </w:r>
     </w:p>
     <w:p>
-      <w:hyperlink r:id="rId5" w:history="1">
+      <w:hyperlink r:id="rId11" w:history="1">
         <w:r>
           <w:rPr>
             <w:rStyle w:val="Hyperlink"/>
@@ -669,7 +1009,7 @@
       </w:hyperlink>
     </w:p>
     <w:p>
-      <w:hyperlink r:id="rId6" w:history="1">
+      <w:hyperlink r:id="rId12" w:history="1">
         <w:r>
           <w:rPr>
             <w:rStyle w:val="Hyperlink"/>
@@ -1098,7 +1438,6 @@
   <w:style w:type="character" w:default="1" w:styleId="DefaultParagraphFont">
     <w:name w:val="Default Paragraph Font"/>
     <w:uiPriority w:val="1"/>
-    <w:semiHidden/>
     <w:unhideWhenUsed/>
   </w:style>
   <w:style w:type="table" w:default="1" w:styleId="TableNormal">
@@ -1441,4 +1780,16 @@
     </a:ext>
   </a:extLst>
 </a:theme>
+</file>
+
+<file path=customXml/item1.xml><?xml version="1.0" encoding="utf-8"?>
+<b:Sources xmlns:b="http://schemas.openxmlformats.org/officeDocument/2006/bibliography" xmlns="http://schemas.openxmlformats.org/officeDocument/2006/bibliography" SelectedStyle="\APASixthEditionOfficeOnline.xsl" StyleName="APA" Version="6"/>
+</file>
+
+<file path=customXml/itemProps1.xml><?xml version="1.0" encoding="utf-8"?>
+<ds:datastoreItem xmlns:ds="http://schemas.openxmlformats.org/officeDocument/2006/customXml" ds:itemID="{92971BA1-0C69-4A63-A763-8BA912BF60A8}">
+  <ds:schemaRefs>
+    <ds:schemaRef ds:uri="http://schemas.openxmlformats.org/officeDocument/2006/bibliography"/>
+  </ds:schemaRefs>
+</ds:datastoreItem>
 </file>
</xml_diff>